<commit_message>
De-brand to 'Browser Manager'; add Clear Cookies dropdown & Memory Saver deep-link; move admin gate to settings cog; default all settings off
</commit_message>
<xml_diff>
--- a/DEPLOYMENT_GUIDE.docx
+++ b/DEPLOYMENT_GUIDE.docx
@@ -2,13 +2,13 @@
 <file path=word/document.xml><?xml version="1.0" encoding="utf-8"?>
 <w:document xmlns:w="http://schemas.openxmlformats.org/wordprocessingml/2006/main" xmlns:m="http://schemas.openxmlformats.org/officeDocument/2006/math" xmlns:r="http://schemas.openxmlformats.org/officeDocument/2006/relationships" xmlns:o="urn:schemas-microsoft-com:office:office" xmlns:v="urn:schemas-microsoft-com:vml" xmlns:w10="urn:schemas-microsoft-com:office:word" xmlns:a="http://schemas.openxmlformats.org/drawingml/2006/main" xmlns:pic="http://schemas.openxmlformats.org/drawingml/2006/picture" xmlns:wp="http://schemas.openxmlformats.org/drawingml/2006/wordprocessingDrawing">
   <w:body>
-    <w:bookmarkStart w:id="54" w:name="Xe82dba56ca19ef31e44e5b8f802aa234069e005"/>
+    <w:bookmarkStart w:id="54" w:name="X3249a0222c996813ea9c9e8c57da2b7f262ede5"/>
     <w:p>
       <w:pPr>
         <w:pStyle w:val="Heading1"/>
       </w:pPr>
       <w:r>
-        <w:t xml:space="preserve">MCK Browser Manager - Google Admin Deployment Guide</w:t>
+        <w:t xml:space="preserve">Browser Manager - Google Admin Deployment Guide</w:t>
       </w:r>
     </w:p>
     <w:p>
@@ -26,7 +26,7 @@
           <w:bCs/>
           <w:b/>
         </w:rPr>
-        <w:t xml:space="preserve">MCK Browser Manager</w:t>
+        <w:t xml:space="preserve">Browser Manager</w:t>
       </w:r>
       <w:r>
         <w:t xml:space="preserve"> </w:t>
@@ -966,7 +966,7 @@
         <w:t xml:space="preserve"> </w:t>
       </w:r>
       <w:r>
-        <w:t xml:space="preserve">MCK Browser Manager</w:t>
+        <w:t xml:space="preserve">Browser Manager</w:t>
       </w:r>
     </w:p>
     <w:p>
@@ -987,7 +987,7 @@
         <w:t xml:space="preserve"> </w:t>
       </w:r>
       <w:r>
-        <w:t xml:space="preserve">Enterprise browser management for McKinney — one-click cache clearing, performance tuning, and privacy controls.</w:t>
+        <w:t xml:space="preserve">Enterprise browser management for your organization — one-click cache clearing, performance tuning, and privacy controls.</w:t>
       </w:r>
     </w:p>
     <w:p>
@@ -1017,7 +1017,7 @@
         <w:rPr>
           <w:rStyle w:val="VerbatimChar"/>
         </w:rPr>
-        <w:t xml:space="preserve">MCK Browser Manager is an enterprise Chrome extension for McKinney employees, </w:t>
+        <w:t xml:space="preserve">Browser Manager is an enterprise Chrome extension for employees, </w:t>
       </w:r>
       <w:r>
         <w:br/>
@@ -1083,7 +1083,7 @@
         <w:rPr>
           <w:rStyle w:val="VerbatimChar"/>
         </w:rPr>
-        <w:t xml:space="preserve">• Centrally managed by McKinney IT Help Desk</w:t>
+        <w:t xml:space="preserve">• Centrally managed by IT Help Desk</w:t>
       </w:r>
       <w:r>
         <w:br/>
@@ -2352,7 +2352,7 @@
         <w:t xml:space="preserve">“</w:t>
       </w:r>
       <w:r>
-        <w:t xml:space="preserve">MCK Browser Manager</w:t>
+        <w:t xml:space="preserve">Browser Manager</w:t>
       </w:r>
       <w:r>
         <w:t xml:space="preserve">”</w:t>
@@ -4331,7 +4331,7 @@
         <w:rPr>
           <w:rStyle w:val="VerbatimChar"/>
         </w:rPr>
-        <w:t xml:space="preserve">servicedesk.mckinney.com</w:t>
+        <w:t xml:space="preserve">support.example.com</w:t>
       </w:r>
       <w:r>
         <w:t xml:space="preserve">)</w:t>
@@ -4476,7 +4476,7 @@
           <w:rPr>
             <w:rStyle w:val="Hyperlink"/>
           </w:rPr>
-          <w:t xml:space="preserve">https://servicedesk.mckinney.com/support/home</w:t>
+          <w:t xml:space="preserve">https://support.example.com</w:t>
         </w:r>
       </w:hyperlink>
     </w:p>

</xml_diff>